<commit_message>
docs: finalize case study deliverables
</commit_message>
<xml_diff>
--- a/deliverables/Enzo Nicolás Spotorno Bieger.docx
+++ b/deliverables/Enzo Nicolás Spotorno Bieger.docx
@@ -1284,10 +1284,7 @@
         <w:rPr/>
       </w:pPr>
       <w:r>
-        <w:rPr>
-          <w:rtl w:val="0"/>
-        </w:rPr>
-        <w:t xml:space="preserve">A manutenção preditiva está revolucionando a forma como as indústrias gerenciam ativos e evitam falhas não</w:t>
+        <w:t>A manutenção preditiva está revolucionando a forma como as indústrias gerenciam ativos e evitam falhas não planejadas. Ao utilizar técnicas como aprendizado de máquina e análise avançada de dados, a IA capacita as organizações a prever a necessidade de manutenção com base em indicadores de desempenho em tempo real, através do monitoramento de diferentes variáveis coletadas diretamente do equipamento em análise. Uma indústria de grande porte localizada no estado de Santa Catarina, contatou o SENAI SC sobre o interesse no desenvolvimento de um projeto completo de manutenção preditiva, aplicado a máquinas e equipamentos do seu chão de fábrica, o projeto inclui algoritmos capazes de identificar diferentes falhas em suas máquinas e equipamentos.</w:t>
       </w:r>
     </w:p>
     <w:p>
@@ -1299,7 +1296,6 @@
         <w:rPr>
           <w:rtl w:val="0"/>
         </w:rPr>
-        <w:t xml:space="preserve">planejadas. Ao utilizar técnicas como aprendizado de máquina e análise avançada de dados, a IA capacita as</w:t>
       </w:r>
     </w:p>
     <w:p>
@@ -1308,10 +1304,7 @@
         <w:rPr/>
       </w:pPr>
       <w:r>
-        <w:rPr>
-          <w:rtl w:val="0"/>
-        </w:rPr>
-        <w:t xml:space="preserve">organizações a prever a necessidade de manutenção com base em indicadores de desempenho em tempo real,</w:t>
+        <w:t>O time de automação e instrumentação da empresa já instalou diferentes sensores e placas as quais enviam dados para um banco de dados, esse banco de dados foi modelado e implementado pelo time de Software da empresa. Para facilitar os desenvolvimentos e o paralelismo das atividades do projeto, os dados foram repassados para que o time de IA, para que eles possam realizar as devidas análises.</w:t>
       </w:r>
     </w:p>
     <w:p>
@@ -1320,10 +1313,7 @@
         <w:rPr/>
       </w:pPr>
       <w:r>
-        <w:rPr>
-          <w:rtl w:val="0"/>
-        </w:rPr>
-        <w:t xml:space="preserve">através do monitoramento de diferentes variáveis coletadas diretamente do equipamento em análise. Uma</w:t>
+        <w:t>Você como mentor da área de Inteligência Artificial, foi designado para montar uma arquitetura completa e cronograma de execução desse projeto. Além disso o diretor da empresa solicitou uma prévia de implementação para os algoritmos de IA. Sendo assim, através dos dados disponibilizados, você deve desenvolver um modelo de Aprendizado de Máquina para identificar padrões do equipamento em análise, de tal forma que o diretor da empresa seja convencido a contratar o projeto.</w:t>
       </w:r>
     </w:p>
     <w:p>
@@ -1335,7 +1325,6 @@
         <w:rPr>
           <w:rtl w:val="0"/>
         </w:rPr>
-        <w:t xml:space="preserve">indústria de grande porte localizada no estado de Santa Catarina, contatou o SENAI SC sobre o interesse no</w:t>
       </w:r>
     </w:p>
     <w:p>
@@ -1344,212 +1333,7 @@
         <w:rPr/>
       </w:pPr>
       <w:r>
-        <w:rPr>
-          <w:rtl w:val="0"/>
-        </w:rPr>
-        <w:t xml:space="preserve">desenvolvimento de um projeto completo de manutenção preditiva, aplicado a máquinas e equipamentos do seu</w:t>
-      </w:r>
-    </w:p>
-    <w:p>
-      <w:pPr>
-        <w:jc w:val="both"/>
-        <w:rPr/>
-      </w:pPr>
-      <w:r>
-        <w:rPr>
-          <w:rtl w:val="0"/>
-        </w:rPr>
-        <w:t xml:space="preserve">chão de fábrica, o projeto inclui algoritmos capazes de identificar diferentes falhas em suas máquinas e</w:t>
-      </w:r>
-    </w:p>
-    <w:p>
-      <w:pPr>
-        <w:jc w:val="both"/>
-        <w:rPr/>
-      </w:pPr>
-      <w:r>
-        <w:rPr>
-          <w:rtl w:val="0"/>
-        </w:rPr>
-        <w:t xml:space="preserve">equipamentos.</w:t>
-      </w:r>
-    </w:p>
-    <w:p>
-      <w:pPr>
-        <w:jc w:val="both"/>
-        <w:rPr/>
-      </w:pPr>
-      <w:r>
-        <w:rPr>
-          <w:rtl w:val="0"/>
-        </w:rPr>
-      </w:r>
-    </w:p>
-    <w:p>
-      <w:pPr>
-        <w:jc w:val="both"/>
-        <w:rPr/>
-      </w:pPr>
-      <w:r>
-        <w:rPr>
-          <w:rtl w:val="0"/>
-        </w:rPr>
-        <w:t xml:space="preserve">O time de automação e instrumentação da empresa já instalou diferentes sensores e placas as quais enviam</w:t>
-      </w:r>
-    </w:p>
-    <w:p>
-      <w:pPr>
-        <w:jc w:val="both"/>
-        <w:rPr/>
-      </w:pPr>
-      <w:r>
-        <w:rPr>
-          <w:rtl w:val="0"/>
-        </w:rPr>
-        <w:t xml:space="preserve">dados para um banco de dados, esse banco de dados foi modelado e implementado pelo time de Software da</w:t>
-      </w:r>
-    </w:p>
-    <w:p>
-      <w:pPr>
-        <w:jc w:val="both"/>
-        <w:rPr/>
-      </w:pPr>
-      <w:r>
-        <w:rPr>
-          <w:rtl w:val="0"/>
-        </w:rPr>
-        <w:t xml:space="preserve">empresa. Para facilitar os desenvolvimentos e o paralelismo das atividades do projeto, os dados foram repassados</w:t>
-      </w:r>
-    </w:p>
-    <w:p>
-      <w:pPr>
-        <w:jc w:val="both"/>
-        <w:rPr/>
-      </w:pPr>
-      <w:r>
-        <w:rPr>
-          <w:rtl w:val="0"/>
-        </w:rPr>
-        <w:t xml:space="preserve">para que o time de IA, para que eles possam realizar as devidas análises.</w:t>
-      </w:r>
-    </w:p>
-    <w:p>
-      <w:pPr>
-        <w:jc w:val="both"/>
-        <w:rPr/>
-      </w:pPr>
-      <w:r>
-        <w:rPr>
-          <w:rtl w:val="0"/>
-        </w:rPr>
-        <w:t xml:space="preserve">Você como mentor da área de Inteligência Artificial, foi designado para montar uma arquitetura completa e</w:t>
-      </w:r>
-    </w:p>
-    <w:p>
-      <w:pPr>
-        <w:jc w:val="both"/>
-        <w:rPr/>
-      </w:pPr>
-      <w:r>
-        <w:rPr>
-          <w:rtl w:val="0"/>
-        </w:rPr>
-        <w:t xml:space="preserve">cronograma de execução desse projeto. Além disso o diretor da empresa solicitou uma prévia de implementação</w:t>
-      </w:r>
-    </w:p>
-    <w:p>
-      <w:pPr>
-        <w:jc w:val="both"/>
-        <w:rPr/>
-      </w:pPr>
-      <w:r>
-        <w:rPr>
-          <w:rtl w:val="0"/>
-        </w:rPr>
-        <w:t xml:space="preserve">para os algoritmos de IA. Sendo assim, através dos dados disponibilizados, você deve desenvolver um modelo de</w:t>
-      </w:r>
-    </w:p>
-    <w:p>
-      <w:pPr>
-        <w:jc w:val="both"/>
-        <w:rPr/>
-      </w:pPr>
-      <w:r>
-        <w:rPr>
-          <w:rtl w:val="0"/>
-        </w:rPr>
-        <w:t xml:space="preserve">Aprendizado de Máquina para identificar padrões do equipamento em análise, de tal forma que o diretor da</w:t>
-      </w:r>
-    </w:p>
-    <w:p>
-      <w:pPr>
-        <w:jc w:val="both"/>
-        <w:rPr/>
-      </w:pPr>
-      <w:r>
-        <w:rPr>
-          <w:rtl w:val="0"/>
-        </w:rPr>
-        <w:t xml:space="preserve">empresa seja convencido a contratar o projeto.</w:t>
-      </w:r>
-    </w:p>
-    <w:p>
-      <w:pPr>
-        <w:jc w:val="both"/>
-        <w:rPr/>
-      </w:pPr>
-      <w:r>
-        <w:rPr>
-          <w:rtl w:val="0"/>
-        </w:rPr>
-      </w:r>
-    </w:p>
-    <w:p>
-      <w:pPr>
-        <w:jc w:val="both"/>
-        <w:rPr/>
-      </w:pPr>
-      <w:r>
-        <w:rPr>
-          <w:rtl w:val="0"/>
-        </w:rPr>
-        <w:t xml:space="preserve">Desenvolva o Pipeline completo de um projeto de Aprendizado de Máquina, desde a definição da arquitetura,</w:t>
-      </w:r>
-    </w:p>
-    <w:p>
-      <w:pPr>
-        <w:jc w:val="both"/>
-        <w:rPr/>
-      </w:pPr>
-      <w:r>
-        <w:rPr>
-          <w:rtl w:val="0"/>
-        </w:rPr>
-        <w:t xml:space="preserve">análise e preparação dos dados adquiridos até a disponibilização visual dos resultados. O candidato é livre para</w:t>
-      </w:r>
-    </w:p>
-    <w:p>
-      <w:pPr>
-        <w:jc w:val="both"/>
-        <w:rPr/>
-      </w:pPr>
-      <w:r>
-        <w:rPr>
-          <w:rtl w:val="0"/>
-        </w:rPr>
-        <w:t xml:space="preserve">usar a criatividade sobre qual caminho seguir e como utilizar os dados para a resolução do problema, porém</w:t>
-      </w:r>
-    </w:p>
-    <w:p>
-      <w:pPr>
-        <w:jc w:val="both"/>
-        <w:rPr/>
-      </w:pPr>
-      <w:r>
-        <w:rPr>
-          <w:rtl w:val="0"/>
-        </w:rPr>
-        <w:t xml:space="preserve">espera-se que seja utilizada linguagem Python para os desenvolvimentos.</w:t>
+        <w:t>Desenvolva o Pipeline completo de um projeto de Aprendizado de Máquina, desde a definição da arquitetura, análise e preparação dos dados adquiridos até a disponibilização visual dos resultados. O candidato é livre para usar a criatividade sobre qual caminho seguir e como utilizar os dados para a resolução do problema, porém espera-se que seja utilizada linguagem Python para os desenvolvimentos.</w:t>
       </w:r>
     </w:p>
     <w:p>
@@ -1586,58 +1370,7 @@
         <w:rPr/>
       </w:pPr>
       <w:r>
-        <w:rPr>
-          <w:rtl w:val="0"/>
-        </w:rPr>
-        <w:t xml:space="preserve">No link abaixo, é disponibilizado seis (6) arquivos com extensão .npy. Sabe-se que cada arquivo foi adquirido por</w:t>
-      </w:r>
-    </w:p>
-    <w:p>
-      <w:pPr>
-        <w:jc w:val="both"/>
-        <w:rPr/>
-      </w:pPr>
-      <w:r>
-        <w:rPr>
-          <w:rtl w:val="0"/>
-        </w:rPr>
-        <w:t xml:space="preserve">um sensor, os dados são oriundos de uma máquina com motor elétrico, os quais foram aquisitados a uma taxa de</w:t>
-      </w:r>
-    </w:p>
-    <w:p>
-      <w:pPr>
-        <w:jc w:val="both"/>
-        <w:rPr/>
-      </w:pPr>
-      <w:r>
-        <w:rPr>
-          <w:rtl w:val="0"/>
-        </w:rPr>
-        <w:t xml:space="preserve">10 KHz. Os dados de todos os sensores, foram adquiridos de forma simultânea, ou seja, no mesmo instante de</w:t>
-      </w:r>
-    </w:p>
-    <w:p>
-      <w:pPr>
-        <w:jc w:val="both"/>
-        <w:rPr/>
-      </w:pPr>
-      <w:r>
-        <w:rPr>
-          <w:rtl w:val="0"/>
-        </w:rPr>
-        <w:t xml:space="preserve">tempo. O arquivo Classes.npy possui diferentes estados de funcionamento dessa máquina, podendo ou não</w:t>
-      </w:r>
-    </w:p>
-    <w:p>
-      <w:pPr>
-        <w:jc w:val="both"/>
-        <w:rPr/>
-      </w:pPr>
-      <w:r>
-        <w:rPr>
-          <w:rtl w:val="0"/>
-        </w:rPr>
-        <w:t xml:space="preserve">possuir diferentes falhas e/ou funcionamento normal.</w:t>
+        <w:t>No link abaixo, é disponibilizado seis (6) arquivos com extensão .npy. Sabe-se que cada arquivo foi adquirido por um sensor, os dados são oriundos de uma máquina com motor elétrico, os quais foram aquisitados a uma taxa de 10 KHz. Os dados de todos os sensores, foram adquiridos de forma simultânea, ou seja, no mesmo instante de tempo. O arquivo Classes.npy possui diferentes estados de funcionamento dessa máquina, podendo ou não possuir diferentes falhas e/ou funcionamento normal.</w:t>
       </w:r>
     </w:p>
     <w:p>
@@ -1689,22 +1422,7 @@
         <w:rPr/>
       </w:pPr>
       <w:r>
-        <w:rPr>
-          <w:rtl w:val="0"/>
-        </w:rPr>
-        <w:t xml:space="preserve">OBS: sensores, são dispositivos capazes de medir grandezas físicas, tem seu funcionamento com base em sinais</w:t>
-      </w:r>
-    </w:p>
-    <w:p>
-      <w:pPr>
-        <w:jc w:val="both"/>
-        <w:rPr/>
-      </w:pPr>
-      <w:r>
-        <w:rPr>
-          <w:rtl w:val="0"/>
-        </w:rPr>
-        <w:t xml:space="preserve">elétricos, em ambiente industrial podem captar sinais de ruídos e até mesmo entrarem em falha.</w:t>
+        <w:t>OBS: sensores, são dispositivos capazes de medir grandezas físicas, tem seu funcionamento com base em sinais elétricos, em ambiente industrial podem captar sinais de ruídos e até mesmo entrarem em falha.</w:t>
       </w:r>
     </w:p>
     <w:p>
@@ -1777,10 +1495,7 @@
         <w:rPr/>
       </w:pPr>
       <w:r>
-        <w:rPr>
-          <w:rtl w:val="0"/>
-        </w:rPr>
-        <w:t xml:space="preserve">• Desenvolvimento e organização do código para solucionar a problemática e convencer o diretor da empresa a</w:t>
+        <w:t>• Desenvolvimento e organização do código para solucionar a problemática e convencer o diretor da empresa a realizar o projeto com o SENAI SC;</w:t>
       </w:r>
     </w:p>
     <w:p>
@@ -1792,7 +1507,7 @@
         <w:rPr>
           <w:rtl w:val="0"/>
         </w:rPr>
-        <w:t xml:space="preserve">realizar o projeto com o SENAI SC;</w:t>
+        <w:t xml:space="preserve">• Estruturação do projeto no GitHub;</w:t>
       </w:r>
     </w:p>
     <w:p>
@@ -1804,7 +1519,7 @@
         <w:rPr>
           <w:rtl w:val="0"/>
         </w:rPr>
-        <w:t xml:space="preserve">• Estruturação do projeto no GitHub;</w:t>
+        <w:t xml:space="preserve">• Interpretação do problema;</w:t>
       </w:r>
     </w:p>
     <w:p>
@@ -1813,34 +1528,7 @@
         <w:rPr/>
       </w:pPr>
       <w:r>
-        <w:rPr>
-          <w:rtl w:val="0"/>
-        </w:rPr>
-        <w:t xml:space="preserve">• Interpretação do problema;</w:t>
-      </w:r>
-    </w:p>
-    <w:p>
-      <w:pPr>
-        <w:jc w:val="both"/>
-        <w:rPr/>
-      </w:pPr>
-      <w:r>
-        <w:rPr>
-          <w:rtl w:val="0"/>
-        </w:rPr>
-        <w:t xml:space="preserve">• Etapas do Pipeline realizadas e qualidade de sua execução com Pré-processamento, Engenharia de Requisitos,</w:t>
-      </w:r>
-    </w:p>
-    <w:p>
-      <w:pPr>
-        <w:jc w:val="both"/>
-        <w:rPr/>
-      </w:pPr>
-      <w:r>
-        <w:rPr>
-          <w:rtl w:val="0"/>
-        </w:rPr>
-        <w:t xml:space="preserve">Seleção do Modelo, Avaliação do Modelo e disponibilização.</w:t>
+        <w:t>• Etapas do Pipeline realizadas e qualidade de sua execução com Pré-processamento, Engenharia de Requisitos, Seleção do Modelo, Avaliação do Modelo e disponibilização.</w:t>
       </w:r>
     </w:p>
     <w:p>
@@ -1901,10 +1589,7 @@
         <w:rPr/>
       </w:pPr>
       <w:r>
-        <w:rPr>
-          <w:rtl w:val="0"/>
-        </w:rPr>
-        <w:t xml:space="preserve">OBS1: O candidato deve submeter seu projeto independentemente da não realização de uma das etapas do</w:t>
+        <w:t>OBS1: O candidato deve submeter seu projeto independentemente da não realização de uma das etapas do exigidas.</w:t>
       </w:r>
     </w:p>
     <w:p>
@@ -1913,34 +1598,7 @@
         <w:rPr/>
       </w:pPr>
       <w:r>
-        <w:rPr>
-          <w:rtl w:val="0"/>
-        </w:rPr>
-        <w:t xml:space="preserve">exigidas.</w:t>
-      </w:r>
-    </w:p>
-    <w:p>
-      <w:pPr>
-        <w:jc w:val="both"/>
-        <w:rPr/>
-      </w:pPr>
-      <w:r>
-        <w:rPr>
-          <w:rtl w:val="0"/>
-        </w:rPr>
-        <w:t xml:space="preserve">OBS2: A apresentação do projeto pode ser feita utilizando qualquer ferramenta (power point, jupyter notebook,</w:t>
-      </w:r>
-    </w:p>
-    <w:p>
-      <w:pPr>
-        <w:jc w:val="both"/>
-        <w:rPr/>
-      </w:pPr>
-      <w:r>
-        <w:rPr>
-          <w:rtl w:val="0"/>
-        </w:rPr>
-        <w:t xml:space="preserve">Google Colab etc.)</w:t>
+        <w:t>OBS2: A apresentação do projeto pode ser feita utilizando qualquer ferramenta (power point, jupyter notebook, Google Colab etc.)</w:t>
       </w:r>
     </w:p>
     <w:p>
@@ -1977,22 +1635,7 @@
         <w:rPr/>
       </w:pPr>
       <w:r>
-        <w:rPr>
-          <w:rtl w:val="0"/>
-        </w:rPr>
-        <w:t xml:space="preserve">É permitido o uso de qualquer IDE e Biblioteca de Aprendizado de Máquina, desde que respeite às seguintes</w:t>
-      </w:r>
-    </w:p>
-    <w:p>
-      <w:pPr>
-        <w:jc w:val="both"/>
-        <w:rPr/>
-      </w:pPr>
-      <w:r>
-        <w:rPr>
-          <w:rtl w:val="0"/>
-        </w:rPr>
-        <w:t xml:space="preserve">exigências:</w:t>
+        <w:t>É permitido o uso de qualquer IDE e Biblioteca de Aprendizado de Máquina, desde que respeite às seguintes exigências:</w:t>
       </w:r>
     </w:p>
     <w:p>
@@ -2165,6 +1808,41 @@
       </w:pPr>
       <w:r>
         <w:t>O case exige duas entregas complementares: uma solução técnica capaz de convencer o diretor e um plano de projeto que reconheça as incertezas ainda abertas. Antes de modelar, os cinco canais foram auditados estatisticamente. Dados 1, 2 e 3 contêm sinal discriminante; Dados 4 permanece praticamente constante; Dados 5 é indistinguível de ruído branco em relação às classes. A coluna adicional de Dados 1 a 3 foi tratada como artefato de exportação após validação, sem depender de inspeção visual isolada.</w:t>
+      </w:r>
+    </w:p>
+    <w:p>
+      <w:pPr>
+        <w:pStyle w:val="CaseBody"/>
+      </w:pPr>
+      <w:r>
+        <w:rPr>
+          <w:b/>
+        </w:rPr>
+        <w:t xml:space="preserve">Detalhamento: </w:t>
+      </w:r>
+      <w:hyperlink r:id="rId14">
+        <w:r>
+          <w:rPr>
+            <w:color w:val="0563C1"/>
+            <w:u w:val="single"/>
+          </w:rPr>
+          <w:t>interpretação do problema</w:t>
+        </w:r>
+      </w:hyperlink>
+      <w:r>
+        <w:t xml:space="preserve"> e </w:t>
+      </w:r>
+      <w:hyperlink r:id="rId9">
+        <w:r>
+          <w:rPr>
+            <w:color w:val="0563C1"/>
+            <w:u w:val="single"/>
+          </w:rPr>
+          <w:t>perguntas para o cliente</w:t>
+        </w:r>
+      </w:hyperlink>
+      <w:r>
+        <w:t>.</w:t>
       </w:r>
     </w:p>
     <w:tbl>
@@ -2680,6 +2358,29 @@
       </w:pPr>
       <w:r>
         <w:t>A arquitetura separa a fonte de dados do cliente, o pipeline de IA e os canais de consumo. Um adaptador configurável lê janelas do banco existente sem duplicar o histórico bruto. O pipeline valida o esquema, aplica os limpadores ajustados apenas no treino, extrai features físicas e produz classe, probabilidades, conjunto conformal e explicação. A API persiste somente resultados de IA e metadados de auditoria; o dashboard consulta essa camada para apoiar a manutenção.</w:t>
+      </w:r>
+    </w:p>
+    <w:p>
+      <w:pPr>
+        <w:pStyle w:val="CaseBody"/>
+      </w:pPr>
+      <w:r>
+        <w:rPr>
+          <w:b/>
+        </w:rPr>
+        <w:t xml:space="preserve">Detalhamento: </w:t>
+      </w:r>
+      <w:hyperlink r:id="rId11">
+        <w:r>
+          <w:rPr>
+            <w:color w:val="0563C1"/>
+            <w:u w:val="single"/>
+          </w:rPr>
+          <w:t>arquitetura completa e diagramas C4</w:t>
+        </w:r>
+      </w:hyperlink>
+      <w:r>
+        <w:t>.</w:t>
       </w:r>
     </w:p>
     <w:p>
@@ -3395,6 +3096,41 @@
     <w:p>
       <w:pPr>
         <w:pStyle w:val="CaseBody"/>
+      </w:pPr>
+      <w:r>
+        <w:rPr>
+          <w:b/>
+        </w:rPr>
+        <w:t xml:space="preserve">Detalhamento: </w:t>
+      </w:r>
+      <w:hyperlink r:id="rId12">
+        <w:r>
+          <w:rPr>
+            <w:color w:val="0563C1"/>
+            <w:u w:val="single"/>
+          </w:rPr>
+          <w:t>cronograma, WBS e premissas</w:t>
+        </w:r>
+      </w:hyperlink>
+      <w:r>
+        <w:t xml:space="preserve">; </w:t>
+      </w:r>
+      <w:hyperlink r:id="rId25">
+        <w:r>
+          <w:rPr>
+            <w:color w:val="0563C1"/>
+            <w:u w:val="single"/>
+          </w:rPr>
+          <w:t>trilha de pesquisa interna</w:t>
+        </w:r>
+      </w:hyperlink>
+      <w:r>
+        <w:t>.</w:t>
+      </w:r>
+    </w:p>
+    <w:p>
+      <w:pPr>
+        <w:pStyle w:val="CaseBody"/>
         <w:keepNext/>
         <w:jc w:val="center"/>
       </w:pPr>
@@ -3414,7 +3150,7 @@
                     <pic:cNvPicPr/>
                   </pic:nvPicPr>
                   <pic:blipFill>
-                    <a:blip r:embed="rId25"/>
+                    <a:blip r:embed="rId26"/>
                     <a:stretch>
                       <a:fillRect/>
                     </a:stretch>
@@ -4974,6 +4710,41 @@
         <w:t>O HistGradientBoosting venceu a comparação entre quatro candidatos. O desempenho alto veio acompanhado de testes de calibração, incerteza, robustez e controles negativos, o que reduz a chance de confundir uma métrica isolada com evidência de viabilidade.</w:t>
       </w:r>
     </w:p>
+    <w:p>
+      <w:pPr>
+        <w:pStyle w:val="CaseBody"/>
+      </w:pPr>
+      <w:r>
+        <w:rPr>
+          <w:b/>
+        </w:rPr>
+        <w:t xml:space="preserve">Evidências reproduzíveis: </w:t>
+      </w:r>
+      <w:hyperlink r:id="rId27">
+        <w:r>
+          <w:rPr>
+            <w:color w:val="0563C1"/>
+            <w:u w:val="single"/>
+          </w:rPr>
+          <w:t>análise dos resultados</w:t>
+        </w:r>
+      </w:hyperlink>
+      <w:r>
+        <w:t xml:space="preserve"> e </w:t>
+      </w:r>
+      <w:hyperlink r:id="rId28">
+        <w:r>
+          <w:rPr>
+            <w:color w:val="0563C1"/>
+            <w:u w:val="single"/>
+          </w:rPr>
+          <w:t>notebook de viabilidade e avaliação</w:t>
+        </w:r>
+      </w:hyperlink>
+      <w:r>
+        <w:t>.</w:t>
+      </w:r>
+    </w:p>
     <w:tbl>
       <w:tblPr>
         <w:tblW w:type="auto" w:w="0"/>
@@ -5598,7 +5369,7 @@
                           <pic:cNvPicPr/>
                         </pic:nvPicPr>
                         <pic:blipFill>
-                          <a:blip r:embed="rId26"/>
+                          <a:blip r:embed="rId29"/>
                           <a:stretch>
                             <a:fillRect/>
                           </a:stretch>
@@ -5648,7 +5419,7 @@
                           <pic:cNvPicPr/>
                         </pic:nvPicPr>
                         <pic:blipFill>
-                          <a:blip r:embed="rId27"/>
+                          <a:blip r:embed="rId30"/>
                           <a:stretch>
                             <a:fillRect/>
                           </a:stretch>
@@ -5703,6 +5474,29 @@
       </w:pPr>
       <w:r>
         <w:t>5 Riscos e controles</w:t>
+      </w:r>
+    </w:p>
+    <w:p>
+      <w:pPr>
+        <w:pStyle w:val="CaseBody"/>
+      </w:pPr>
+      <w:r>
+        <w:rPr>
+          <w:b/>
+        </w:rPr>
+        <w:t xml:space="preserve">Matriz completa: </w:t>
+      </w:r>
+      <w:hyperlink r:id="rId13">
+        <w:r>
+          <w:rPr>
+            <w:color w:val="0563C1"/>
+            <w:u w:val="single"/>
+          </w:rPr>
+          <w:t>riscos e mitigações</w:t>
+        </w:r>
+      </w:hyperlink>
+      <w:r>
+        <w:t>.</w:t>
       </w:r>
     </w:p>
     <w:tbl>
@@ -6384,7 +6178,7 @@
         </w:rPr>
         <w:t xml:space="preserve">Repositório e documentação técnica: </w:t>
       </w:r>
-      <w:hyperlink r:id="rId28">
+      <w:hyperlink r:id="rId31">
         <w:r>
           <w:rPr>
             <w:color w:val="0563C1"/>
@@ -6404,7 +6198,7 @@
         </w:rPr>
         <w:t xml:space="preserve">Apresentação executiva: </w:t>
       </w:r>
-      <w:hyperlink r:id="rId29">
+      <w:hyperlink r:id="rId32">
         <w:r>
           <w:rPr>
             <w:color w:val="0563C1"/>
@@ -6424,7 +6218,7 @@
         </w:rPr>
         <w:t xml:space="preserve">Apresentação técnica: </w:t>
       </w:r>
-      <w:hyperlink r:id="rId30">
+      <w:hyperlink r:id="rId33">
         <w:r>
           <w:rPr>
             <w:color w:val="0563C1"/>
@@ -6444,13 +6238,53 @@
         </w:rPr>
         <w:t xml:space="preserve">Documento principal: </w:t>
       </w:r>
-      <w:hyperlink r:id="rId31">
+      <w:hyperlink r:id="rId34">
         <w:r>
           <w:rPr>
             <w:color w:val="0563C1"/>
             <w:u w:val="single"/>
           </w:rPr>
           <w:t>https://github.com/enzoniko/predictive-maintenance-senai/blob/main/deliverables/Enzo%20Nicol%C3%A1s%20Spotorno%20Bieger.docx</w:t>
+        </w:r>
+      </w:hyperlink>
+    </w:p>
+    <w:p>
+      <w:pPr>
+        <w:pStyle w:val="CaseBody"/>
+      </w:pPr>
+      <w:r>
+        <w:rPr>
+          <w:b/>
+        </w:rPr>
+        <w:t xml:space="preserve">Notebook de auditoria e sinais: </w:t>
+      </w:r>
+      <w:hyperlink r:id="rId35">
+        <w:r>
+          <w:rPr>
+            <w:color w:val="0563C1"/>
+            <w:u w:val="single"/>
+          </w:rPr>
+          <w:t>https://github.com/enzoniko/predictive-maintenance-senai/blob/main/notebooks/01_data_audit_and_signal_analysis.ipynb</w:t>
+        </w:r>
+      </w:hyperlink>
+    </w:p>
+    <w:p>
+      <w:pPr>
+        <w:pStyle w:val="CaseBody"/>
+      </w:pPr>
+      <w:r>
+        <w:rPr>
+          <w:b/>
+        </w:rPr>
+        <w:t xml:space="preserve">Notebook de demonstração da API: </w:t>
+      </w:r>
+      <w:hyperlink r:id="rId36">
+        <w:r>
+          <w:rPr>
+            <w:color w:val="0563C1"/>
+            <w:u w:val="single"/>
+          </w:rPr>
+          <w:t>https://github.com/enzoniko/predictive-maintenance-senai/blob/main/notebooks/03_api_demo.ipynb</w:t>
         </w:r>
       </w:hyperlink>
     </w:p>

</xml_diff>